<commit_message>
Add all team member names and IDs to excel cover, word report, and ratio proofs
</commit_message>
<xml_diff>
--- a/ratio_calculation_proofs.docx
+++ b/ratio_calculation_proofs.docx
@@ -42,9 +42,24 @@
           <w:rFonts w:ascii="Times New Roman" w:hAnsi="Times New Roman"/>
           <w:b w:val="0"/>
           <w:i w:val="0"/>
-          <w:sz w:val="20"/>
-        </w:rPr>
-        <w:t>K P Manoj | 2025MB26539 | FMA EC1</w:t>
+          <w:sz w:val="18"/>
+        </w:rPr>
+        <w:t>K P Manoj (2025MB26539) | T Venkata Suresh (2025MB26590) | Japleen Kaur Khorana (2025MB26602)</w:t>
+      </w:r>
+    </w:p>
+    <w:p>
+      <w:pPr>
+        <w:spacing w:after="40" w:line="240" w:lineRule="auto"/>
+        <w:jc w:val="center"/>
+      </w:pPr>
+      <w:r>
+        <w:rPr>
+          <w:rFonts w:ascii="Times New Roman" w:hAnsi="Times New Roman"/>
+          <w:b w:val="0"/>
+          <w:i w:val="0"/>
+          <w:sz w:val="18"/>
+        </w:rPr>
+        <w:t>Varsha PS (2025MB26503) | Prashanth G (2025MB26598) | FMA EC1</w:t>
       </w:r>
     </w:p>
     <w:p>

</xml_diff>